<commit_message>
docs(sprint-09): incorporate AWS EC2 implementation screenshots and update final reports
</commit_message>
<xml_diff>
--- a/docs/Sprint_09_Report.docx
+++ b/docs/Sprint_09_Report.docx
@@ -338,7 +338,7 @@
         <w:br/>
         <w:t>3. Automated Testing (13 pytest unit tests as Quality Gate)</w:t>
         <w:br/>
-        <w:t>4. Docker Build &amp; Tag (premkumar2005/chennai-flood-backend:build-)</w:t>
+        <w:t>4. Docker Build &amp; Tag (premkumar2005/chennai-flood-backend:build-${BUILD_NUMBER})</w:t>
         <w:br/>
         <w:t>5. Push to Docker Hub Registry</w:t>
         <w:br/>
@@ -400,7 +400,308 @@
         <w:pStyle w:val="Heading1"/>
       </w:pPr>
       <w:r>
-        <w:t>4. Automated Testing (Quality Gate)</w:t>
+        <w:t>4. AWS EC2 Target Environment Hardening &amp; Setup</w:t>
+      </w:r>
+    </w:p>
+    <w:p>
+      <w:r>
+        <w:t>The AWS EC2 production environment (16.192.243.169) was configured with Security Groups, Swap memory space, Docker Compose CLI plugin, dynamic override mappings, and authorized SSH keys:</w:t>
+      </w:r>
+    </w:p>
+    <w:p>
+      <w:r>
+        <w:drawing>
+          <wp:inline xmlns:a="http://schemas.openxmlformats.org/drawingml/2006/main" xmlns:pic="http://schemas.openxmlformats.org/drawingml/2006/picture">
+            <wp:extent cx="5669280" cy="6081450"/>
+            <wp:docPr id="2" name="Picture 2"/>
+            <wp:cNvGraphicFramePr>
+              <a:graphicFrameLocks noChangeAspect="1"/>
+            </wp:cNvGraphicFramePr>
+            <a:graphic>
+              <a:graphicData uri="http://schemas.openxmlformats.org/drawingml/2006/picture">
+                <pic:pic>
+                  <pic:nvPicPr>
+                    <pic:cNvPr id="0" name="ec2_01_aws_security_group.jpeg"/>
+                    <pic:cNvPicPr/>
+                  </pic:nvPicPr>
+                  <pic:blipFill>
+                    <a:blip r:embed="rId10"/>
+                    <a:stretch>
+                      <a:fillRect/>
+                    </a:stretch>
+                  </pic:blipFill>
+                  <pic:spPr>
+                    <a:xfrm>
+                      <a:off x="0" y="0"/>
+                      <a:ext cx="5669280" cy="6081450"/>
+                    </a:xfrm>
+                    <a:prstGeom prst="rect"/>
+                  </pic:spPr>
+                </pic:pic>
+              </a:graphicData>
+            </a:graphic>
+          </wp:inline>
+        </w:drawing>
+      </w:r>
+    </w:p>
+    <w:p>
+      <w:pPr>
+        <w:jc w:val="center"/>
+      </w:pPr>
+      <w:r>
+        <w:rPr>
+          <w:i/>
+          <w:sz w:val="18"/>
+        </w:rPr>
+        <w:t>Figure 2: AWS Security Group (sg-01121a3b0b733af3a) Inbound Rules</w:t>
+      </w:r>
+    </w:p>
+    <w:p>
+      <w:r>
+        <w:drawing>
+          <wp:inline xmlns:a="http://schemas.openxmlformats.org/drawingml/2006/main" xmlns:pic="http://schemas.openxmlformats.org/drawingml/2006/picture">
+            <wp:extent cx="5669280" cy="1742607"/>
+            <wp:docPr id="3" name="Picture 3"/>
+            <wp:cNvGraphicFramePr>
+              <a:graphicFrameLocks noChangeAspect="1"/>
+            </wp:cNvGraphicFramePr>
+            <a:graphic>
+              <a:graphicData uri="http://schemas.openxmlformats.org/drawingml/2006/picture">
+                <pic:pic>
+                  <pic:nvPicPr>
+                    <pic:cNvPr id="0" name="ec2_02_swap_configuration.jpeg"/>
+                    <pic:cNvPicPr/>
+                  </pic:nvPicPr>
+                  <pic:blipFill>
+                    <a:blip r:embed="rId11"/>
+                    <a:stretch>
+                      <a:fillRect/>
+                    </a:stretch>
+                  </pic:blipFill>
+                  <pic:spPr>
+                    <a:xfrm>
+                      <a:off x="0" y="0"/>
+                      <a:ext cx="5669280" cy="1742607"/>
+                    </a:xfrm>
+                    <a:prstGeom prst="rect"/>
+                  </pic:spPr>
+                </pic:pic>
+              </a:graphicData>
+            </a:graphic>
+          </wp:inline>
+        </w:drawing>
+      </w:r>
+    </w:p>
+    <w:p>
+      <w:pPr>
+        <w:jc w:val="center"/>
+      </w:pPr>
+      <w:r>
+        <w:rPr>
+          <w:i/>
+          <w:sz w:val="18"/>
+        </w:rPr>
+        <w:t>Figure 3: EC2 Swap Memory Configuration (1024 MiB)</w:t>
+      </w:r>
+    </w:p>
+    <w:p>
+      <w:r>
+        <w:drawing>
+          <wp:inline xmlns:a="http://schemas.openxmlformats.org/drawingml/2006/main" xmlns:pic="http://schemas.openxmlformats.org/drawingml/2006/picture">
+            <wp:extent cx="5669280" cy="2409830"/>
+            <wp:docPr id="4" name="Picture 4"/>
+            <wp:cNvGraphicFramePr>
+              <a:graphicFrameLocks noChangeAspect="1"/>
+            </wp:cNvGraphicFramePr>
+            <a:graphic>
+              <a:graphicData uri="http://schemas.openxmlformats.org/drawingml/2006/picture">
+                <pic:pic>
+                  <pic:nvPicPr>
+                    <pic:cNvPr id="0" name="ec2_06_docker_compose_cli_plugin.jpeg"/>
+                    <pic:cNvPicPr/>
+                  </pic:nvPicPr>
+                  <pic:blipFill>
+                    <a:blip r:embed="rId12"/>
+                    <a:stretch>
+                      <a:fillRect/>
+                    </a:stretch>
+                  </pic:blipFill>
+                  <pic:spPr>
+                    <a:xfrm>
+                      <a:off x="0" y="0"/>
+                      <a:ext cx="5669280" cy="2409830"/>
+                    </a:xfrm>
+                    <a:prstGeom prst="rect"/>
+                  </pic:spPr>
+                </pic:pic>
+              </a:graphicData>
+            </a:graphic>
+          </wp:inline>
+        </w:drawing>
+      </w:r>
+    </w:p>
+    <w:p>
+      <w:pPr>
+        <w:jc w:val="center"/>
+      </w:pPr>
+      <w:r>
+        <w:rPr>
+          <w:i/>
+          <w:sz w:val="18"/>
+        </w:rPr>
+        <w:t>Figure 4: EC2 Terminal - Docker Compose CLI v2 Plugin Setup</w:t>
+      </w:r>
+    </w:p>
+    <w:p>
+      <w:r>
+        <w:drawing>
+          <wp:inline xmlns:a="http://schemas.openxmlformats.org/drawingml/2006/main" xmlns:pic="http://schemas.openxmlformats.org/drawingml/2006/picture">
+            <wp:extent cx="5669280" cy="3463274"/>
+            <wp:docPr id="5" name="Picture 5"/>
+            <wp:cNvGraphicFramePr>
+              <a:graphicFrameLocks noChangeAspect="1"/>
+            </wp:cNvGraphicFramePr>
+            <a:graphic>
+              <a:graphicData uri="http://schemas.openxmlformats.org/drawingml/2006/picture">
+                <pic:pic>
+                  <pic:nvPicPr>
+                    <pic:cNvPr id="0" name="ec2_03_compose_override_setup.jpeg"/>
+                    <pic:cNvPicPr/>
+                  </pic:nvPicPr>
+                  <pic:blipFill>
+                    <a:blip r:embed="rId13"/>
+                    <a:stretch>
+                      <a:fillRect/>
+                    </a:stretch>
+                  </pic:blipFill>
+                  <pic:spPr>
+                    <a:xfrm>
+                      <a:off x="0" y="0"/>
+                      <a:ext cx="5669280" cy="3463274"/>
+                    </a:xfrm>
+                    <a:prstGeom prst="rect"/>
+                  </pic:spPr>
+                </pic:pic>
+              </a:graphicData>
+            </a:graphic>
+          </wp:inline>
+        </w:drawing>
+      </w:r>
+    </w:p>
+    <w:p>
+      <w:pPr>
+        <w:jc w:val="center"/>
+      </w:pPr>
+      <w:r>
+        <w:rPr>
+          <w:i/>
+          <w:sz w:val="18"/>
+        </w:rPr>
+        <w:t>Figure 5: EC2 Terminal - docker-compose.override.yml Configuration</w:t>
+      </w:r>
+    </w:p>
+    <w:p>
+      <w:r>
+        <w:drawing>
+          <wp:inline xmlns:a="http://schemas.openxmlformats.org/drawingml/2006/main" xmlns:pic="http://schemas.openxmlformats.org/drawingml/2006/picture">
+            <wp:extent cx="5669280" cy="4559046"/>
+            <wp:docPr id="6" name="Picture 6"/>
+            <wp:cNvGraphicFramePr>
+              <a:graphicFrameLocks noChangeAspect="1"/>
+            </wp:cNvGraphicFramePr>
+            <a:graphic>
+              <a:graphicData uri="http://schemas.openxmlformats.org/drawingml/2006/picture">
+                <pic:pic>
+                  <pic:nvPicPr>
+                    <pic:cNvPr id="0" name="ec2_04_compose_config_and_ssh_auth.jpeg"/>
+                    <pic:cNvPicPr/>
+                  </pic:nvPicPr>
+                  <pic:blipFill>
+                    <a:blip r:embed="rId14"/>
+                    <a:stretch>
+                      <a:fillRect/>
+                    </a:stretch>
+                  </pic:blipFill>
+                  <pic:spPr>
+                    <a:xfrm>
+                      <a:off x="0" y="0"/>
+                      <a:ext cx="5669280" cy="4559046"/>
+                    </a:xfrm>
+                    <a:prstGeom prst="rect"/>
+                  </pic:spPr>
+                </pic:pic>
+              </a:graphicData>
+            </a:graphic>
+          </wp:inline>
+        </w:drawing>
+      </w:r>
+    </w:p>
+    <w:p>
+      <w:pPr>
+        <w:jc w:val="center"/>
+      </w:pPr>
+      <w:r>
+        <w:rPr>
+          <w:i/>
+          <w:sz w:val="18"/>
+        </w:rPr>
+        <w:t>Figure 6: EC2 Terminal - Tag Resolution Check and SSH Key Authorization</w:t>
+      </w:r>
+    </w:p>
+    <w:p>
+      <w:r>
+        <w:drawing>
+          <wp:inline xmlns:a="http://schemas.openxmlformats.org/drawingml/2006/main" xmlns:pic="http://schemas.openxmlformats.org/drawingml/2006/picture">
+            <wp:extent cx="5669280" cy="4997712"/>
+            <wp:docPr id="7" name="Picture 7"/>
+            <wp:cNvGraphicFramePr>
+              <a:graphicFrameLocks noChangeAspect="1"/>
+            </wp:cNvGraphicFramePr>
+            <a:graphic>
+              <a:graphicData uri="http://schemas.openxmlformats.org/drawingml/2006/picture">
+                <pic:pic>
+                  <pic:nvPicPr>
+                    <pic:cNvPr id="0" name="ec2_05_frontend_container_build.jpeg"/>
+                    <pic:cNvPicPr/>
+                  </pic:nvPicPr>
+                  <pic:blipFill>
+                    <a:blip r:embed="rId15"/>
+                    <a:stretch>
+                      <a:fillRect/>
+                    </a:stretch>
+                  </pic:blipFill>
+                  <pic:spPr>
+                    <a:xfrm>
+                      <a:off x="0" y="0"/>
+                      <a:ext cx="5669280" cy="4997712"/>
+                    </a:xfrm>
+                    <a:prstGeom prst="rect"/>
+                  </pic:spPr>
+                </pic:pic>
+              </a:graphicData>
+            </a:graphic>
+          </wp:inline>
+        </w:drawing>
+      </w:r>
+    </w:p>
+    <w:p>
+      <w:pPr>
+        <w:jc w:val="center"/>
+      </w:pPr>
+      <w:r>
+        <w:rPr>
+          <w:i/>
+          <w:sz w:val="18"/>
+        </w:rPr>
+        <w:t>Figure 7: EC2 Terminal - Frontend Container Build and Startup on Port 3000</w:t>
+      </w:r>
+    </w:p>
+    <w:p>
+      <w:pPr>
+        <w:pStyle w:val="Heading1"/>
+      </w:pPr>
+      <w:r>
+        <w:t>5. Automated Testing (Quality Gate)</w:t>
       </w:r>
     </w:p>
     <w:p>
@@ -413,7 +714,7 @@
         <w:pStyle w:val="Heading1"/>
       </w:pPr>
       <w:r>
-        <w:t>5. Failure Scenario Demonstration (Build #13)</w:t>
+        <w:t>6. Failure Scenario Demonstration (Build #13)</w:t>
       </w:r>
     </w:p>
     <w:p>
@@ -426,7 +727,7 @@
         <w:drawing>
           <wp:inline xmlns:a="http://schemas.openxmlformats.org/drawingml/2006/main" xmlns:pic="http://schemas.openxmlformats.org/drawingml/2006/picture">
             <wp:extent cx="5669280" cy="3543300"/>
-            <wp:docPr id="2" name="Picture 2"/>
+            <wp:docPr id="8" name="Picture 8"/>
             <wp:cNvGraphicFramePr>
               <a:graphicFrameLocks noChangeAspect="1"/>
             </wp:cNvGraphicFramePr>
@@ -438,7 +739,7 @@
                     <pic:cNvPicPr/>
                   </pic:nvPicPr>
                   <pic:blipFill>
-                    <a:blip r:embed="rId10"/>
+                    <a:blip r:embed="rId16"/>
                     <a:stretch>
                       <a:fillRect/>
                     </a:stretch>
@@ -466,7 +767,7 @@
           <w:i/>
           <w:sz w:val="18"/>
         </w:rPr>
-        <w:t>Figure 2: Build #13 Console Log - Failure Gating Preventing Deployment</w:t>
+        <w:t>Figure 8: Build #13 Console Log - Failure Gating Preventing Deployment</w:t>
       </w:r>
     </w:p>
     <w:p>
@@ -474,7 +775,7 @@
         <w:pStyle w:val="Heading1"/>
       </w:pPr>
       <w:r>
-        <w:t>6. Recovery &amp; Successful Deployment (Build #14)</w:t>
+        <w:t>7. Recovery &amp; Successful Deployment (Build #14)</w:t>
       </w:r>
     </w:p>
     <w:p>
@@ -487,7 +788,7 @@
         <w:drawing>
           <wp:inline xmlns:a="http://schemas.openxmlformats.org/drawingml/2006/main" xmlns:pic="http://schemas.openxmlformats.org/drawingml/2006/picture">
             <wp:extent cx="5669280" cy="3543300"/>
-            <wp:docPr id="3" name="Picture 3"/>
+            <wp:docPr id="9" name="Picture 9"/>
             <wp:cNvGraphicFramePr>
               <a:graphicFrameLocks noChangeAspect="1"/>
             </wp:cNvGraphicFramePr>
@@ -499,7 +800,7 @@
                     <pic:cNvPicPr/>
                   </pic:nvPicPr>
                   <pic:blipFill>
-                    <a:blip r:embed="rId11"/>
+                    <a:blip r:embed="rId17"/>
                     <a:stretch>
                       <a:fillRect/>
                     </a:stretch>
@@ -527,20 +828,7 @@
           <w:i/>
           <w:sz w:val="18"/>
         </w:rPr>
-        <w:t>Figure 3: Build #14 Stage View - Successful End-to-End Execution</w:t>
-      </w:r>
-    </w:p>
-    <w:p>
-      <w:pPr>
-        <w:pStyle w:val="Heading1"/>
-      </w:pPr>
-      <w:r>
-        <w:t>7. Live Application Verification on AWS EC2</w:t>
-      </w:r>
-    </w:p>
-    <w:p>
-      <w:r>
-        <w:t>The application was verified live on AWS EC2 (16.192.243.169:8000 and 16.192.243.169:3000):</w:t>
+        <w:t>Figure 9: Build #14 Stage View - Successful End-to-End Execution</w:t>
       </w:r>
     </w:p>
     <w:p>
@@ -548,7 +836,7 @@
         <w:drawing>
           <wp:inline xmlns:a="http://schemas.openxmlformats.org/drawingml/2006/main" xmlns:pic="http://schemas.openxmlformats.org/drawingml/2006/picture">
             <wp:extent cx="5669280" cy="3543300"/>
-            <wp:docPr id="4" name="Picture 4"/>
+            <wp:docPr id="10" name="Picture 10"/>
             <wp:cNvGraphicFramePr>
               <a:graphicFrameLocks noChangeAspect="1"/>
             </wp:cNvGraphicFramePr>
@@ -556,11 +844,11 @@
               <a:graphicData uri="http://schemas.openxmlformats.org/drawingml/2006/picture">
                 <pic:pic>
                   <pic:nvPicPr>
-                    <pic:cNvPr id="0" name="05_ec2_api_docs.png"/>
+                    <pic:cNvPr id="0" name="03_jenkins_build14_console.png"/>
                     <pic:cNvPicPr/>
                   </pic:nvPicPr>
                   <pic:blipFill>
-                    <a:blip r:embed="rId12"/>
+                    <a:blip r:embed="rId18"/>
                     <a:stretch>
                       <a:fillRect/>
                     </a:stretch>
@@ -588,7 +876,20 @@
           <w:i/>
           <w:sz w:val="18"/>
         </w:rPr>
-        <w:t>Figure 4: Live Swagger API Documentation on AWS EC2</w:t>
+        <w:t>Figure 10: Build #14 Console Log - Deployment &amp; Health Check Verification</w:t>
+      </w:r>
+    </w:p>
+    <w:p>
+      <w:pPr>
+        <w:pStyle w:val="Heading1"/>
+      </w:pPr>
+      <w:r>
+        <w:t>8. Live Application Verification on AWS EC2</w:t>
+      </w:r>
+    </w:p>
+    <w:p>
+      <w:r>
+        <w:t>The application was verified live on AWS EC2 (16.192.243.169:8000 and 16.192.243.169:3000):</w:t>
       </w:r>
     </w:p>
     <w:p>
@@ -596,7 +897,7 @@
         <w:drawing>
           <wp:inline xmlns:a="http://schemas.openxmlformats.org/drawingml/2006/main" xmlns:pic="http://schemas.openxmlformats.org/drawingml/2006/picture">
             <wp:extent cx="5669280" cy="3543300"/>
-            <wp:docPr id="5" name="Picture 5"/>
+            <wp:docPr id="11" name="Picture 11"/>
             <wp:cNvGraphicFramePr>
               <a:graphicFrameLocks noChangeAspect="1"/>
             </wp:cNvGraphicFramePr>
@@ -604,11 +905,11 @@
               <a:graphicData uri="http://schemas.openxmlformats.org/drawingml/2006/picture">
                 <pic:pic>
                   <pic:nvPicPr>
-                    <pic:cNvPr id="0" name="07_ec2_frontend_dashboard.png"/>
+                    <pic:cNvPr id="0" name="05_ec2_api_docs.png"/>
                     <pic:cNvPicPr/>
                   </pic:nvPicPr>
                   <pic:blipFill>
-                    <a:blip r:embed="rId13"/>
+                    <a:blip r:embed="rId19"/>
                     <a:stretch>
                       <a:fillRect/>
                     </a:stretch>
@@ -636,7 +937,55 @@
           <w:i/>
           <w:sz w:val="18"/>
         </w:rPr>
-        <w:t>Figure 5: Live React Frontend Dashboard on AWS EC2</w:t>
+        <w:t>Figure 11: Live Swagger API Interactive Documentation on AWS EC2</w:t>
+      </w:r>
+    </w:p>
+    <w:p>
+      <w:r>
+        <w:drawing>
+          <wp:inline xmlns:a="http://schemas.openxmlformats.org/drawingml/2006/main" xmlns:pic="http://schemas.openxmlformats.org/drawingml/2006/picture">
+            <wp:extent cx="5669280" cy="3543300"/>
+            <wp:docPr id="12" name="Picture 12"/>
+            <wp:cNvGraphicFramePr>
+              <a:graphicFrameLocks noChangeAspect="1"/>
+            </wp:cNvGraphicFramePr>
+            <a:graphic>
+              <a:graphicData uri="http://schemas.openxmlformats.org/drawingml/2006/picture">
+                <pic:pic>
+                  <pic:nvPicPr>
+                    <pic:cNvPr id="0" name="07_ec2_frontend_dashboard.png"/>
+                    <pic:cNvPicPr/>
+                  </pic:nvPicPr>
+                  <pic:blipFill>
+                    <a:blip r:embed="rId20"/>
+                    <a:stretch>
+                      <a:fillRect/>
+                    </a:stretch>
+                  </pic:blipFill>
+                  <pic:spPr>
+                    <a:xfrm>
+                      <a:off x="0" y="0"/>
+                      <a:ext cx="5669280" cy="3543300"/>
+                    </a:xfrm>
+                    <a:prstGeom prst="rect"/>
+                  </pic:spPr>
+                </pic:pic>
+              </a:graphicData>
+            </a:graphic>
+          </wp:inline>
+        </w:drawing>
+      </w:r>
+    </w:p>
+    <w:p>
+      <w:pPr>
+        <w:jc w:val="center"/>
+      </w:pPr>
+      <w:r>
+        <w:rPr>
+          <w:i/>
+          <w:sz w:val="18"/>
+        </w:rPr>
+        <w:t>Figure 12: Live React Frontend Dashboard on AWS EC2</w:t>
       </w:r>
     </w:p>
     <w:p>
@@ -644,7 +993,7 @@
         <w:pStyle w:val="Heading1"/>
       </w:pPr>
       <w:r>
-        <w:t>8. Individual Contribution &amp; Conclusion</w:t>
+        <w:t>9. Individual Contribution &amp; Conclusion</w:t>
       </w:r>
     </w:p>
     <w:p>

</xml_diff>